<commit_message>
docs: actualizar informe v1.1.2 con capturas limpias y pendientes ya resueltos
</commit_message>
<xml_diff>
--- a/docs/report/SXA-RTX-Analytics-Informe-v1.1.2.docx
+++ b/docs/report/SXA-RTX-Analytics-Informe-v1.1.2.docx
@@ -78,7 +78,7 @@
         <w:rPr>
           <w:sz w:val="22"/>
         </w:rPr>
-        <w:t>Fecha: 2026-10-07 09:47</w:t>
+        <w:t>Fecha: 2026-10-07 10:24</w:t>
       </w:r>
     </w:p>
     <w:p>
@@ -1237,10 +1237,10 @@
           <w:sz w:val="22"/>
         </w:rPr>
         <w:drawing>
-          <wp:inline distT="0" distB="0" distL="0" distR="0" wp14:anchorId="7C60754A" wp14:editId="241CA629">
+          <wp:inline distT="0" distB="0" distL="0" distR="0" wp14:anchorId="02D67403" wp14:editId="625684AA">
             <wp:extent cx="5976000" cy="3735317"/>
             <wp:effectExtent l="0" t="0" r="5715" b="0"/>
-            <wp:docPr id="725812043" name="Picture 1"/>
+            <wp:docPr id="154939547" name="Picture 1"/>
             <wp:cNvGraphicFramePr>
               <a:graphicFrameLocks xmlns:a="http://schemas.openxmlformats.org/drawingml/2006/main" noChangeAspect="1"/>
             </wp:cNvGraphicFramePr>
@@ -1248,7 +1248,7 @@
               <a:graphicData uri="http://schemas.openxmlformats.org/drawingml/2006/picture">
                 <pic:pic xmlns:pic="http://schemas.openxmlformats.org/drawingml/2006/picture">
                   <pic:nvPicPr>
-                    <pic:cNvPr id="725812043" name=""/>
+                    <pic:cNvPr id="154939547" name=""/>
                     <pic:cNvPicPr/>
                   </pic:nvPicPr>
                   <pic:blipFill>
@@ -1342,10 +1342,10 @@
           <w:sz w:val="22"/>
         </w:rPr>
         <w:drawing>
-          <wp:inline distT="0" distB="0" distL="0" distR="0" wp14:anchorId="23FFE37A" wp14:editId="2F1718BC">
+          <wp:inline distT="0" distB="0" distL="0" distR="0" wp14:anchorId="3273F11C" wp14:editId="67D14525">
             <wp:extent cx="5976000" cy="3735317"/>
             <wp:effectExtent l="0" t="0" r="5715" b="0"/>
-            <wp:docPr id="1373152641" name="Picture 2"/>
+            <wp:docPr id="1196603854" name="Picture 2"/>
             <wp:cNvGraphicFramePr>
               <a:graphicFrameLocks xmlns:a="http://schemas.openxmlformats.org/drawingml/2006/main" noChangeAspect="1"/>
             </wp:cNvGraphicFramePr>
@@ -1353,7 +1353,7 @@
               <a:graphicData uri="http://schemas.openxmlformats.org/drawingml/2006/picture">
                 <pic:pic xmlns:pic="http://schemas.openxmlformats.org/drawingml/2006/picture">
                   <pic:nvPicPr>
-                    <pic:cNvPr id="1373152641" name=""/>
+                    <pic:cNvPr id="1196603854" name=""/>
                     <pic:cNvPicPr/>
                   </pic:nvPicPr>
                   <pic:blipFill>
@@ -1414,10 +1414,10 @@
         </w:rPr>
         <w:lastRenderedPageBreak/>
         <w:drawing>
-          <wp:inline distT="0" distB="0" distL="0" distR="0" wp14:anchorId="6A16EE4F" wp14:editId="6DA35C41">
+          <wp:inline distT="0" distB="0" distL="0" distR="0" wp14:anchorId="5793D32B" wp14:editId="77DCAC77">
             <wp:extent cx="5976000" cy="5549959"/>
             <wp:effectExtent l="0" t="0" r="5715" b="0"/>
-            <wp:docPr id="897602574" name="Picture 3"/>
+            <wp:docPr id="1508574218" name="Picture 3"/>
             <wp:cNvGraphicFramePr>
               <a:graphicFrameLocks xmlns:a="http://schemas.openxmlformats.org/drawingml/2006/main" noChangeAspect="1"/>
             </wp:cNvGraphicFramePr>
@@ -1425,7 +1425,7 @@
               <a:graphicData uri="http://schemas.openxmlformats.org/drawingml/2006/picture">
                 <pic:pic xmlns:pic="http://schemas.openxmlformats.org/drawingml/2006/picture">
                   <pic:nvPicPr>
-                    <pic:cNvPr id="897602574" name=""/>
+                    <pic:cNvPr id="1508574218" name=""/>
                     <pic:cNvPicPr/>
                   </pic:nvPicPr>
                   <pic:blipFill>
@@ -1499,10 +1499,10 @@
         </w:rPr>
         <w:lastRenderedPageBreak/>
         <w:drawing>
-          <wp:inline distT="0" distB="0" distL="0" distR="0" wp14:anchorId="6A4DC978" wp14:editId="712D3050">
+          <wp:inline distT="0" distB="0" distL="0" distR="0" wp14:anchorId="3BBA4574" wp14:editId="0037CDBE">
             <wp:extent cx="5976000" cy="3735317"/>
             <wp:effectExtent l="0" t="0" r="5715" b="0"/>
-            <wp:docPr id="1752980429" name="Picture 4"/>
+            <wp:docPr id="2081419223" name="Picture 4"/>
             <wp:cNvGraphicFramePr>
               <a:graphicFrameLocks xmlns:a="http://schemas.openxmlformats.org/drawingml/2006/main" noChangeAspect="1"/>
             </wp:cNvGraphicFramePr>
@@ -1510,7 +1510,7 @@
               <a:graphicData uri="http://schemas.openxmlformats.org/drawingml/2006/picture">
                 <pic:pic xmlns:pic="http://schemas.openxmlformats.org/drawingml/2006/picture">
                   <pic:nvPicPr>
-                    <pic:cNvPr id="1752980429" name=""/>
+                    <pic:cNvPr id="2081419223" name=""/>
                     <pic:cNvPicPr/>
                   </pic:nvPicPr>
                   <pic:blipFill>
@@ -1570,10 +1570,10 @@
           <w:sz w:val="22"/>
         </w:rPr>
         <w:drawing>
-          <wp:inline distT="0" distB="0" distL="0" distR="0" wp14:anchorId="78FBB74C" wp14:editId="317F069B">
+          <wp:inline distT="0" distB="0" distL="0" distR="0" wp14:anchorId="3B8F850C" wp14:editId="14E715B0">
             <wp:extent cx="5976000" cy="3735317"/>
             <wp:effectExtent l="0" t="0" r="5715" b="0"/>
-            <wp:docPr id="3786989" name="Picture 5"/>
+            <wp:docPr id="536872544" name="Picture 5"/>
             <wp:cNvGraphicFramePr>
               <a:graphicFrameLocks xmlns:a="http://schemas.openxmlformats.org/drawingml/2006/main" noChangeAspect="1"/>
             </wp:cNvGraphicFramePr>
@@ -1581,7 +1581,7 @@
               <a:graphicData uri="http://schemas.openxmlformats.org/drawingml/2006/picture">
                 <pic:pic xmlns:pic="http://schemas.openxmlformats.org/drawingml/2006/picture">
                   <pic:nvPicPr>
-                    <pic:cNvPr id="3786989" name=""/>
+                    <pic:cNvPr id="536872544" name=""/>
                     <pic:cNvPicPr/>
                   </pic:nvPicPr>
                   <pic:blipFill>
@@ -1643,10 +1643,10 @@
         </w:rPr>
         <w:lastRenderedPageBreak/>
         <w:drawing>
-          <wp:inline distT="0" distB="0" distL="0" distR="0" wp14:anchorId="33A99979" wp14:editId="380BA328">
+          <wp:inline distT="0" distB="0" distL="0" distR="0" wp14:anchorId="36062751" wp14:editId="0A986F00">
             <wp:extent cx="5976000" cy="3735317"/>
             <wp:effectExtent l="0" t="0" r="5715" b="0"/>
-            <wp:docPr id="1720046210" name="Picture 6"/>
+            <wp:docPr id="1409358275" name="Picture 6"/>
             <wp:cNvGraphicFramePr>
               <a:graphicFrameLocks xmlns:a="http://schemas.openxmlformats.org/drawingml/2006/main" noChangeAspect="1"/>
             </wp:cNvGraphicFramePr>
@@ -1654,7 +1654,7 @@
               <a:graphicData uri="http://schemas.openxmlformats.org/drawingml/2006/picture">
                 <pic:pic xmlns:pic="http://schemas.openxmlformats.org/drawingml/2006/picture">
                   <pic:nvPicPr>
-                    <pic:cNvPr id="1720046210" name=""/>
+                    <pic:cNvPr id="1409358275" name=""/>
                     <pic:cNvPicPr/>
                   </pic:nvPicPr>
                   <pic:blipFill>
@@ -1715,10 +1715,10 @@
           <w:sz w:val="22"/>
         </w:rPr>
         <w:drawing>
-          <wp:inline distT="0" distB="0" distL="0" distR="0" wp14:anchorId="2461FEBD" wp14:editId="4D83100D">
+          <wp:inline distT="0" distB="0" distL="0" distR="0" wp14:anchorId="1A8BEEC5" wp14:editId="2B9EEA8A">
             <wp:extent cx="5976000" cy="3735317"/>
             <wp:effectExtent l="0" t="0" r="5715" b="0"/>
-            <wp:docPr id="1382758081" name="Picture 7"/>
+            <wp:docPr id="2049397278" name="Picture 7"/>
             <wp:cNvGraphicFramePr>
               <a:graphicFrameLocks xmlns:a="http://schemas.openxmlformats.org/drawingml/2006/main" noChangeAspect="1"/>
             </wp:cNvGraphicFramePr>
@@ -1726,7 +1726,7 @@
               <a:graphicData uri="http://schemas.openxmlformats.org/drawingml/2006/picture">
                 <pic:pic xmlns:pic="http://schemas.openxmlformats.org/drawingml/2006/picture">
                   <pic:nvPicPr>
-                    <pic:cNvPr id="1382758081" name=""/>
+                    <pic:cNvPr id="2049397278" name=""/>
                     <pic:cNvPicPr/>
                   </pic:nvPicPr>
                   <pic:blipFill>
@@ -1788,10 +1788,10 @@
         </w:rPr>
         <w:lastRenderedPageBreak/>
         <w:drawing>
-          <wp:inline distT="0" distB="0" distL="0" distR="0" wp14:anchorId="31FDF5AC" wp14:editId="6B80F6A5">
+          <wp:inline distT="0" distB="0" distL="0" distR="0" wp14:anchorId="2CCE9DDA" wp14:editId="30684800">
             <wp:extent cx="5976000" cy="3735317"/>
             <wp:effectExtent l="0" t="0" r="5715" b="0"/>
-            <wp:docPr id="393462407" name="Picture 8"/>
+            <wp:docPr id="1981238952" name="Picture 8"/>
             <wp:cNvGraphicFramePr>
               <a:graphicFrameLocks xmlns:a="http://schemas.openxmlformats.org/drawingml/2006/main" noChangeAspect="1"/>
             </wp:cNvGraphicFramePr>
@@ -1799,7 +1799,7 @@
               <a:graphicData uri="http://schemas.openxmlformats.org/drawingml/2006/picture">
                 <pic:pic xmlns:pic="http://schemas.openxmlformats.org/drawingml/2006/picture">
                   <pic:nvPicPr>
-                    <pic:cNvPr id="393462407" name=""/>
+                    <pic:cNvPr id="1981238952" name=""/>
                     <pic:cNvPicPr/>
                   </pic:nvPicPr>
                   <pic:blipFill>
@@ -1860,10 +1860,10 @@
           <w:sz w:val="22"/>
         </w:rPr>
         <w:drawing>
-          <wp:inline distT="0" distB="0" distL="0" distR="0" wp14:anchorId="635F0B11" wp14:editId="4E17360A">
+          <wp:inline distT="0" distB="0" distL="0" distR="0" wp14:anchorId="1CE7559A" wp14:editId="3C8AB5AB">
             <wp:extent cx="5976000" cy="3735317"/>
             <wp:effectExtent l="0" t="0" r="5715" b="0"/>
-            <wp:docPr id="596466879" name="Picture 9"/>
+            <wp:docPr id="1963923744" name="Picture 9"/>
             <wp:cNvGraphicFramePr>
               <a:graphicFrameLocks xmlns:a="http://schemas.openxmlformats.org/drawingml/2006/main" noChangeAspect="1"/>
             </wp:cNvGraphicFramePr>
@@ -1871,7 +1871,7 @@
               <a:graphicData uri="http://schemas.openxmlformats.org/drawingml/2006/picture">
                 <pic:pic xmlns:pic="http://schemas.openxmlformats.org/drawingml/2006/picture">
                   <pic:nvPicPr>
-                    <pic:cNvPr id="596466879" name=""/>
+                    <pic:cNvPr id="1963923744" name=""/>
                     <pic:cNvPicPr/>
                   </pic:nvPicPr>
                   <pic:blipFill>
@@ -1945,10 +1945,10 @@
         </w:rPr>
         <w:lastRenderedPageBreak/>
         <w:drawing>
-          <wp:inline distT="0" distB="0" distL="0" distR="0" wp14:anchorId="311C825E" wp14:editId="52637F4B">
+          <wp:inline distT="0" distB="0" distL="0" distR="0" wp14:anchorId="123B06CD" wp14:editId="04EABE14">
             <wp:extent cx="5976000" cy="3735317"/>
             <wp:effectExtent l="0" t="0" r="5715" b="0"/>
-            <wp:docPr id="309732727" name="Picture 10"/>
+            <wp:docPr id="1452565021" name="Picture 10"/>
             <wp:cNvGraphicFramePr>
               <a:graphicFrameLocks xmlns:a="http://schemas.openxmlformats.org/drawingml/2006/main" noChangeAspect="1"/>
             </wp:cNvGraphicFramePr>
@@ -1956,7 +1956,7 @@
               <a:graphicData uri="http://schemas.openxmlformats.org/drawingml/2006/picture">
                 <pic:pic xmlns:pic="http://schemas.openxmlformats.org/drawingml/2006/picture">
                   <pic:nvPicPr>
-                    <pic:cNvPr id="309732727" name=""/>
+                    <pic:cNvPr id="1452565021" name=""/>
                     <pic:cNvPicPr/>
                   </pic:nvPicPr>
                   <pic:blipFill>
@@ -2017,10 +2017,10 @@
         </w:rPr>
         <w:lastRenderedPageBreak/>
         <w:drawing>
-          <wp:inline distT="0" distB="0" distL="0" distR="0" wp14:anchorId="61FC5A05" wp14:editId="57B83F5C">
+          <wp:inline distT="0" distB="0" distL="0" distR="0" wp14:anchorId="063C19A9" wp14:editId="434338E7">
             <wp:extent cx="5976000" cy="5782345"/>
             <wp:effectExtent l="0" t="0" r="5715" b="8890"/>
-            <wp:docPr id="334492943" name="Picture 11"/>
+            <wp:docPr id="2005831353" name="Picture 11"/>
             <wp:cNvGraphicFramePr>
               <a:graphicFrameLocks xmlns:a="http://schemas.openxmlformats.org/drawingml/2006/main" noChangeAspect="1"/>
             </wp:cNvGraphicFramePr>
@@ -2028,7 +2028,7 @@
               <a:graphicData uri="http://schemas.openxmlformats.org/drawingml/2006/picture">
                 <pic:pic xmlns:pic="http://schemas.openxmlformats.org/drawingml/2006/picture">
                   <pic:nvPicPr>
-                    <pic:cNvPr id="334492943" name=""/>
+                    <pic:cNvPr id="2005831353" name=""/>
                     <pic:cNvPicPr/>
                   </pic:nvPicPr>
                   <pic:blipFill>
@@ -2091,10 +2091,10 @@
           <w:noProof/>
         </w:rPr>
         <w:drawing>
-          <wp:inline distT="0" distB="0" distL="0" distR="0" wp14:anchorId="7D4C3834" wp14:editId="12300839">
+          <wp:inline distT="0" distB="0" distL="0" distR="0" wp14:anchorId="05E16221" wp14:editId="710761E3">
             <wp:extent cx="5976000" cy="3735317"/>
             <wp:effectExtent l="0" t="0" r="5715" b="0"/>
-            <wp:docPr id="1417617964" name="Picture 12"/>
+            <wp:docPr id="893629003" name="Picture 12"/>
             <wp:cNvGraphicFramePr>
               <a:graphicFrameLocks xmlns:a="http://schemas.openxmlformats.org/drawingml/2006/main" noChangeAspect="1"/>
             </wp:cNvGraphicFramePr>
@@ -2102,7 +2102,7 @@
               <a:graphicData uri="http://schemas.openxmlformats.org/drawingml/2006/picture">
                 <pic:pic xmlns:pic="http://schemas.openxmlformats.org/drawingml/2006/picture">
                   <pic:nvPicPr>
-                    <pic:cNvPr id="1417617964" name=""/>
+                    <pic:cNvPr id="893629003" name=""/>
                     <pic:cNvPicPr/>
                   </pic:nvPicPr>
                   <pic:blipFill>
@@ -2642,10 +2642,10 @@
           <w:noProof/>
         </w:rPr>
         <w:drawing>
-          <wp:inline distT="0" distB="0" distL="0" distR="0" wp14:anchorId="20E6D0D5" wp14:editId="39DDEF3F">
+          <wp:inline distT="0" distB="0" distL="0" distR="0" wp14:anchorId="5998BB69" wp14:editId="4154E5F9">
             <wp:extent cx="5976000" cy="3735317"/>
             <wp:effectExtent l="0" t="0" r="5715" b="0"/>
-            <wp:docPr id="1194249462" name="Picture 13"/>
+            <wp:docPr id="1368067717" name="Picture 13"/>
             <wp:cNvGraphicFramePr>
               <a:graphicFrameLocks xmlns:a="http://schemas.openxmlformats.org/drawingml/2006/main" noChangeAspect="1"/>
             </wp:cNvGraphicFramePr>
@@ -2653,7 +2653,7 @@
               <a:graphicData uri="http://schemas.openxmlformats.org/drawingml/2006/picture">
                 <pic:pic xmlns:pic="http://schemas.openxmlformats.org/drawingml/2006/picture">
                   <pic:nvPicPr>
-                    <pic:cNvPr id="1194249462" name=""/>
+                    <pic:cNvPr id="1368067717" name=""/>
                     <pic:cNvPicPr/>
                   </pic:nvPicPr>
                   <pic:blipFill>
@@ -3651,15 +3651,7 @@
         <w:ind w:left="340"/>
       </w:pPr>
       <w:r>
-        <w:t>•  El filtro por tipo en SQL Server referencia SXA_RTX_Equipos.Tipo, columna que no existe (el tipo viene de SXA_PCs). Revisar la consulta.</w:t>
-      </w:r>
-    </w:p>
-    <w:p>
-      <w:pPr>
-        <w:pStyle w:val="Heading2"/>
-      </w:pPr>
-      <w:r>
-        <w:t>9.2 PENDIENTE - instalador y despliegue</w:t>
+        <w:t>•  Las conexiones SQL tienen ahora timeout de 5 s (ConnectTimeout) y 15 s de comando, con paso a datos demo si el servidor no responde. Falta validar los tiempos con el SQL real de la planta.</w:t>
       </w:r>
     </w:p>
     <w:p>
@@ -3669,7 +3661,15 @@
         <w:ind w:left="340"/>
       </w:pPr>
       <w:r>
-        <w:t>•  El instalador detecta IIS pero no instala el Hosting Bundle; debe descargarse e instalarse previamente.</w:t>
+        <w:t>•  Equipo.Tipo se guarda al copiar de SXA_PCs.TipoMaquina y el filtro por tipo de /query ya lo consume. Falta revisar el esquema si la base ya existe (EnsureCreated no agrega columnas).</w:t>
+      </w:r>
+    </w:p>
+    <w:p>
+      <w:pPr>
+        <w:pStyle w:val="Heading2"/>
+      </w:pPr>
+      <w:r>
+        <w:t>9.2 PENDIENTE - instalador y despliegue</w:t>
       </w:r>
     </w:p>
     <w:p>
@@ -3679,7 +3679,7 @@
         <w:ind w:left="340"/>
       </w:pPr>
       <w:r>
-        <w:t>•  El instalador no solicita la cadena de conexión ni crea la base de datos.</w:t>
+        <w:t>•  El instalador detecta IIS pero no instala el Hosting Bundle; debe descargarse e instalarse previamente.</w:t>
       </w:r>
     </w:p>
     <w:p>
@@ -3689,15 +3689,7 @@
         <w:ind w:left="340"/>
       </w:pPr>
       <w:r>
-        <w:t>•  El sitio se crea en el puerto 5000; conviene parametrizarlo y configurar HTTPS.</w:t>
-      </w:r>
-    </w:p>
-    <w:p>
-      <w:pPr>
-        <w:pStyle w:val="Heading2"/>
-      </w:pPr>
-      <w:r>
-        <w:t>9.3 PENDIENTE - actualizaciones automáticas</w:t>
+        <w:t>•  El instalador no solicita la cadena de conexión ni crea la base de datos.</w:t>
       </w:r>
     </w:p>
     <w:p>
@@ -3707,7 +3699,15 @@
         <w:ind w:left="340"/>
       </w:pPr>
       <w:r>
-        <w:t>•  Implementar descarga e instalación automática y reinicio del App Pool si se requiere actualización desatendida.</w:t>
+        <w:t>•  El sitio se crea en el puerto 5000; conviene parametrizarlo y configurar HTTPS.</w:t>
+      </w:r>
+    </w:p>
+    <w:p>
+      <w:pPr>
+        <w:pStyle w:val="Heading2"/>
+      </w:pPr>
+      <w:r>
+        <w:t>9.3 PENDIENTE - actualizaciones automáticas</w:t>
       </w:r>
     </w:p>
     <w:p>
@@ -3717,15 +3717,7 @@
         <w:ind w:left="340"/>
       </w:pPr>
       <w:r>
-        <w:t>•  Revisar el aviso de '60 minutos': actualmente la comprobación ocurre una vez al cargar la página, no de forma periódica.</w:t>
-      </w:r>
-    </w:p>
-    <w:p>
-      <w:pPr>
-        <w:pStyle w:val="Heading2"/>
-      </w:pPr>
-      <w:r>
-        <w:t>9.4 Otros puntos técnicos</w:t>
+        <w:t>•  Implementar descarga e instalación automática y reinicio del App Pool si se requiere actualización desatendida.</w:t>
       </w:r>
     </w:p>
     <w:p>
@@ -3735,7 +3727,15 @@
         <w:ind w:left="340"/>
       </w:pPr>
       <w:r>
-        <w:t>•  Migraciones de EF Core: se usa EnsureCreated(); conviene migrar a migraciones formales antes de producción.</w:t>
+        <w:t>•  Revisar el aviso de '60 minutos': actualmente la comprobación ocurre una vez al cargar la página, no de forma periódica.</w:t>
+      </w:r>
+    </w:p>
+    <w:p>
+      <w:pPr>
+        <w:pStyle w:val="Heading2"/>
+      </w:pPr>
+      <w:r>
+        <w:t>9.4 Otros puntos técnicos</w:t>
       </w:r>
     </w:p>
     <w:p>
@@ -3745,7 +3745,7 @@
         <w:ind w:left="340"/>
       </w:pPr>
       <w:r>
-        <w:t>•  La exportación a PDF incluye la tabla y el resumen, pero no la imagen del gráfico.</w:t>
+        <w:t>•  Migraciones de EF Core: se usa EnsureCreated(); conviene migrar a migraciones formales antes de producción.</w:t>
       </w:r>
     </w:p>
     <w:p>
@@ -3755,7 +3755,27 @@
         <w:ind w:left="340"/>
       </w:pPr>
       <w:r>
+        <w:t>•  La exportación a PDF incluye la tabla y el resumen, pero no la imagen del gráfico.</w:t>
+      </w:r>
+    </w:p>
+    <w:p>
+      <w:pPr>
+        <w:pStyle w:val="ListParagraph"/>
+        <w:spacing w:after="40"/>
+        <w:ind w:left="340"/>
+      </w:pPr>
+      <w:r>
         <w:t>•  El importador de configuración no restaura usuarios aunque la interfaz los mencione.</w:t>
+      </w:r>
+    </w:p>
+    <w:p>
+      <w:pPr>
+        <w:pStyle w:val="ListParagraph"/>
+        <w:spacing w:after="40"/>
+        <w:ind w:left="340"/>
+      </w:pPr>
+      <w:r>
+        <w:t>•  Las pestañas de Configuración ya no dejan el spinner colgado si una consulta falla (try/finally), pero conviene un mensaje de error visible para el usuario.</w:t>
       </w:r>
     </w:p>
     <w:p>
@@ -5183,7 +5203,7 @@
     <w:link w:val="Heading1Char"/>
     <w:uiPriority w:val="9"/>
     <w:qFormat/>
-    <w:rsid w:val="002F4017"/>
+    <w:rsid w:val="003F2468"/>
     <w:pPr>
       <w:keepNext/>
       <w:keepLines/>
@@ -5205,7 +5225,7 @@
     <w:uiPriority w:val="9"/>
     <w:unhideWhenUsed/>
     <w:qFormat/>
-    <w:rsid w:val="002F4017"/>
+    <w:rsid w:val="003F2468"/>
     <w:pPr>
       <w:keepNext/>
       <w:keepLines/>
@@ -5228,7 +5248,7 @@
     <w:semiHidden/>
     <w:unhideWhenUsed/>
     <w:qFormat/>
-    <w:rsid w:val="002F4017"/>
+    <w:rsid w:val="003F2468"/>
     <w:pPr>
       <w:keepNext/>
       <w:keepLines/>
@@ -5251,7 +5271,7 @@
     <w:semiHidden/>
     <w:unhideWhenUsed/>
     <w:qFormat/>
-    <w:rsid w:val="002F4017"/>
+    <w:rsid w:val="003F2468"/>
     <w:pPr>
       <w:keepNext/>
       <w:keepLines/>
@@ -5274,7 +5294,7 @@
     <w:semiHidden/>
     <w:unhideWhenUsed/>
     <w:qFormat/>
-    <w:rsid w:val="002F4017"/>
+    <w:rsid w:val="003F2468"/>
     <w:pPr>
       <w:keepNext/>
       <w:keepLines/>
@@ -5295,7 +5315,7 @@
     <w:semiHidden/>
     <w:unhideWhenUsed/>
     <w:qFormat/>
-    <w:rsid w:val="002F4017"/>
+    <w:rsid w:val="003F2468"/>
     <w:pPr>
       <w:keepNext/>
       <w:keepLines/>
@@ -5318,7 +5338,7 @@
     <w:semiHidden/>
     <w:unhideWhenUsed/>
     <w:qFormat/>
-    <w:rsid w:val="002F4017"/>
+    <w:rsid w:val="003F2468"/>
     <w:pPr>
       <w:keepNext/>
       <w:keepLines/>
@@ -5339,7 +5359,7 @@
     <w:semiHidden/>
     <w:unhideWhenUsed/>
     <w:qFormat/>
-    <w:rsid w:val="002F4017"/>
+    <w:rsid w:val="003F2468"/>
     <w:pPr>
       <w:keepNext/>
       <w:keepLines/>
@@ -5362,7 +5382,7 @@
     <w:semiHidden/>
     <w:unhideWhenUsed/>
     <w:qFormat/>
-    <w:rsid w:val="002F4017"/>
+    <w:rsid w:val="003F2468"/>
     <w:pPr>
       <w:keepNext/>
       <w:keepLines/>
@@ -5406,7 +5426,7 @@
     <w:basedOn w:val="DefaultParagraphFont"/>
     <w:link w:val="Heading1"/>
     <w:uiPriority w:val="9"/>
-    <w:rsid w:val="002F4017"/>
+    <w:rsid w:val="003F2468"/>
     <w:rPr>
       <w:rFonts w:asciiTheme="majorHAnsi" w:eastAsiaTheme="majorEastAsia" w:hAnsiTheme="majorHAnsi" w:cstheme="majorBidi"/>
       <w:color w:val="0F4761" w:themeColor="accent1" w:themeShade="BF"/>
@@ -5419,7 +5439,7 @@
     <w:basedOn w:val="DefaultParagraphFont"/>
     <w:link w:val="Heading2"/>
     <w:uiPriority w:val="9"/>
-    <w:rsid w:val="002F4017"/>
+    <w:rsid w:val="003F2468"/>
     <w:rPr>
       <w:rFonts w:asciiTheme="majorHAnsi" w:eastAsiaTheme="majorEastAsia" w:hAnsiTheme="majorHAnsi" w:cstheme="majorBidi"/>
       <w:color w:val="0F4761" w:themeColor="accent1" w:themeShade="BF"/>
@@ -5433,7 +5453,7 @@
     <w:link w:val="Heading3"/>
     <w:uiPriority w:val="9"/>
     <w:semiHidden/>
-    <w:rsid w:val="002F4017"/>
+    <w:rsid w:val="003F2468"/>
     <w:rPr>
       <w:rFonts w:eastAsiaTheme="majorEastAsia" w:cstheme="majorBidi"/>
       <w:color w:val="0F4761" w:themeColor="accent1" w:themeShade="BF"/>
@@ -5447,7 +5467,7 @@
     <w:link w:val="Heading4"/>
     <w:uiPriority w:val="9"/>
     <w:semiHidden/>
-    <w:rsid w:val="002F4017"/>
+    <w:rsid w:val="003F2468"/>
     <w:rPr>
       <w:rFonts w:eastAsiaTheme="majorEastAsia" w:cstheme="majorBidi"/>
       <w:i/>
@@ -5461,7 +5481,7 @@
     <w:link w:val="Heading5"/>
     <w:uiPriority w:val="9"/>
     <w:semiHidden/>
-    <w:rsid w:val="002F4017"/>
+    <w:rsid w:val="003F2468"/>
     <w:rPr>
       <w:rFonts w:eastAsiaTheme="majorEastAsia" w:cstheme="majorBidi"/>
       <w:color w:val="0F4761" w:themeColor="accent1" w:themeShade="BF"/>
@@ -5473,7 +5493,7 @@
     <w:link w:val="Heading6"/>
     <w:uiPriority w:val="9"/>
     <w:semiHidden/>
-    <w:rsid w:val="002F4017"/>
+    <w:rsid w:val="003F2468"/>
     <w:rPr>
       <w:rFonts w:eastAsiaTheme="majorEastAsia" w:cstheme="majorBidi"/>
       <w:i/>
@@ -5487,7 +5507,7 @@
     <w:link w:val="Heading7"/>
     <w:uiPriority w:val="9"/>
     <w:semiHidden/>
-    <w:rsid w:val="002F4017"/>
+    <w:rsid w:val="003F2468"/>
     <w:rPr>
       <w:rFonts w:eastAsiaTheme="majorEastAsia" w:cstheme="majorBidi"/>
       <w:color w:val="595959" w:themeColor="text1" w:themeTint="A6"/>
@@ -5499,7 +5519,7 @@
     <w:link w:val="Heading8"/>
     <w:uiPriority w:val="9"/>
     <w:semiHidden/>
-    <w:rsid w:val="002F4017"/>
+    <w:rsid w:val="003F2468"/>
     <w:rPr>
       <w:rFonts w:eastAsiaTheme="majorEastAsia" w:cstheme="majorBidi"/>
       <w:i/>
@@ -5513,7 +5533,7 @@
     <w:link w:val="Heading9"/>
     <w:uiPriority w:val="9"/>
     <w:semiHidden/>
-    <w:rsid w:val="002F4017"/>
+    <w:rsid w:val="003F2468"/>
     <w:rPr>
       <w:rFonts w:eastAsiaTheme="majorEastAsia" w:cstheme="majorBidi"/>
       <w:color w:val="272727" w:themeColor="text1" w:themeTint="D8"/>
@@ -5526,7 +5546,7 @@
     <w:link w:val="TitleChar"/>
     <w:uiPriority w:val="10"/>
     <w:qFormat/>
-    <w:rsid w:val="002F4017"/>
+    <w:rsid w:val="003F2468"/>
     <w:pPr>
       <w:spacing w:after="80" w:line="240" w:lineRule="auto"/>
       <w:contextualSpacing/>
@@ -5544,7 +5564,7 @@
     <w:basedOn w:val="DefaultParagraphFont"/>
     <w:link w:val="Title"/>
     <w:uiPriority w:val="10"/>
-    <w:rsid w:val="002F4017"/>
+    <w:rsid w:val="003F2468"/>
     <w:rPr>
       <w:rFonts w:asciiTheme="majorHAnsi" w:eastAsiaTheme="majorEastAsia" w:hAnsiTheme="majorHAnsi" w:cstheme="majorBidi"/>
       <w:spacing w:val="-10"/>
@@ -5560,7 +5580,7 @@
     <w:link w:val="SubtitleChar"/>
     <w:uiPriority w:val="11"/>
     <w:qFormat/>
-    <w:rsid w:val="002F4017"/>
+    <w:rsid w:val="003F2468"/>
     <w:pPr>
       <w:numPr>
         <w:ilvl w:val="1"/>
@@ -5579,7 +5599,7 @@
     <w:basedOn w:val="DefaultParagraphFont"/>
     <w:link w:val="Subtitle"/>
     <w:uiPriority w:val="11"/>
-    <w:rsid w:val="002F4017"/>
+    <w:rsid w:val="003F2468"/>
     <w:rPr>
       <w:rFonts w:eastAsiaTheme="majorEastAsia" w:cstheme="majorBidi"/>
       <w:color w:val="595959" w:themeColor="text1" w:themeTint="A6"/>
@@ -5595,7 +5615,7 @@
     <w:link w:val="QuoteChar"/>
     <w:uiPriority w:val="29"/>
     <w:qFormat/>
-    <w:rsid w:val="002F4017"/>
+    <w:rsid w:val="003F2468"/>
     <w:pPr>
       <w:spacing w:before="160"/>
       <w:jc w:val="center"/>
@@ -5611,7 +5631,7 @@
     <w:basedOn w:val="DefaultParagraphFont"/>
     <w:link w:val="Quote"/>
     <w:uiPriority w:val="29"/>
-    <w:rsid w:val="002F4017"/>
+    <w:rsid w:val="003F2468"/>
     <w:rPr>
       <w:i/>
       <w:iCs/>
@@ -5623,7 +5643,7 @@
     <w:basedOn w:val="Normal"/>
     <w:uiPriority w:val="34"/>
     <w:qFormat/>
-    <w:rsid w:val="002F4017"/>
+    <w:rsid w:val="003F2468"/>
     <w:pPr>
       <w:ind w:left="720"/>
       <w:contextualSpacing/>
@@ -5634,7 +5654,7 @@
     <w:basedOn w:val="DefaultParagraphFont"/>
     <w:uiPriority w:val="21"/>
     <w:qFormat/>
-    <w:rsid w:val="002F4017"/>
+    <w:rsid w:val="003F2468"/>
     <w:rPr>
       <w:i/>
       <w:iCs/>
@@ -5648,7 +5668,7 @@
     <w:link w:val="IntenseQuoteChar"/>
     <w:uiPriority w:val="30"/>
     <w:qFormat/>
-    <w:rsid w:val="002F4017"/>
+    <w:rsid w:val="003F2468"/>
     <w:pPr>
       <w:pBdr>
         <w:top w:val="single" w:sz="4" w:space="10" w:color="0F4761" w:themeColor="accent1" w:themeShade="BF"/>
@@ -5669,7 +5689,7 @@
     <w:basedOn w:val="DefaultParagraphFont"/>
     <w:link w:val="IntenseQuote"/>
     <w:uiPriority w:val="30"/>
-    <w:rsid w:val="002F4017"/>
+    <w:rsid w:val="003F2468"/>
     <w:rPr>
       <w:i/>
       <w:iCs/>
@@ -5681,7 +5701,7 @@
     <w:basedOn w:val="DefaultParagraphFont"/>
     <w:uiPriority w:val="32"/>
     <w:qFormat/>
-    <w:rsid w:val="002F4017"/>
+    <w:rsid w:val="003F2468"/>
     <w:rPr>
       <w:b/>
       <w:bCs/>
@@ -5696,7 +5716,7 @@
     <w:link w:val="HeaderChar"/>
     <w:uiPriority w:val="99"/>
     <w:unhideWhenUsed/>
-    <w:rsid w:val="002F4017"/>
+    <w:rsid w:val="003F2468"/>
     <w:pPr>
       <w:tabs>
         <w:tab w:val="center" w:pos="4419"/>
@@ -5710,7 +5730,7 @@
     <w:basedOn w:val="DefaultParagraphFont"/>
     <w:link w:val="Header"/>
     <w:uiPriority w:val="99"/>
-    <w:rsid w:val="002F4017"/>
+    <w:rsid w:val="003F2468"/>
   </w:style>
   <w:style w:type="paragraph" w:styleId="Footer">
     <w:name w:val="footer"/>
@@ -5718,7 +5738,7 @@
     <w:link w:val="FooterChar"/>
     <w:uiPriority w:val="99"/>
     <w:unhideWhenUsed/>
-    <w:rsid w:val="002F4017"/>
+    <w:rsid w:val="003F2468"/>
     <w:pPr>
       <w:tabs>
         <w:tab w:val="center" w:pos="4419"/>
@@ -5732,7 +5752,7 @@
     <w:basedOn w:val="DefaultParagraphFont"/>
     <w:link w:val="Footer"/>
     <w:uiPriority w:val="99"/>
-    <w:rsid w:val="002F4017"/>
+    <w:rsid w:val="003F2468"/>
   </w:style>
 </w:styles>
 </file>

</xml_diff>